<commit_message>
Stabilize multi-device install flow and align guest app behavior.
Ensure QR install consistently serves the full release APK from CMS, simplify the mobile install landing flow, and remove customer login/register friction so installed clients open directly into guest exploration like USB builds.

Made-with: Cursor
</commit_message>
<xml_diff>
--- a/PRD v1.docx
+++ b/PRD v1.docx
@@ -14,8 +14,6 @@
           <w:szCs w:val="28"/>
         </w:rPr>
       </w:pPr>
-      <w:bookmarkStart w:id="0" w:name="_GoBack"/>
-      <w:bookmarkEnd w:id="0"/>
       <w:r>
         <w:rPr>
           <w:rFonts w:hint="default" w:ascii="Times New Roman" w:hAnsi="Times New Roman" w:cs="Times New Roman"/>
@@ -810,6 +808,145 @@
     </w:p>
     <w:p>
       <w:pPr>
+        <w:keepNext w:val="0"/>
+        <w:keepLines w:val="0"/>
+        <w:widowControl/>
+        <w:suppressLineNumbers w:val="0"/>
+        <w:jc w:val="left"/>
+      </w:pPr>
+      <w:r>
+        <w:rPr>
+          <w:rFonts w:ascii="SimSun" w:hAnsi="SimSun" w:eastAsia="SimSun" w:cs="SimSun"/>
+          <w:kern w:val="0"/>
+          <w:sz w:val="24"/>
+          <w:szCs w:val="24"/>
+          <w:lang w:val="en-US" w:eastAsia="zh-CN" w:bidi="ar"/>
+        </w:rPr>
+        <w:drawing>
+          <wp:anchor distT="0" distB="0" distL="114300" distR="114300" simplePos="0" relativeHeight="251659264" behindDoc="0" locked="0" layoutInCell="1" allowOverlap="1">
+            <wp:simplePos x="0" y="0"/>
+            <wp:positionH relativeFrom="column">
+              <wp:posOffset>0</wp:posOffset>
+            </wp:positionH>
+            <wp:positionV relativeFrom="paragraph">
+              <wp:posOffset>0</wp:posOffset>
+            </wp:positionV>
+            <wp:extent cx="6035675" cy="2727960"/>
+            <wp:effectExtent l="0" t="0" r="14605" b="0"/>
+            <wp:wrapSquare wrapText="bothSides"/>
+            <wp:docPr id="4" name="Picture 4" descr="IMG_256"/>
+            <wp:cNvGraphicFramePr>
+              <a:graphicFrameLocks xmlns:a="http://schemas.openxmlformats.org/drawingml/2006/main" noChangeAspect="1"/>
+            </wp:cNvGraphicFramePr>
+            <a:graphic xmlns:a="http://schemas.openxmlformats.org/drawingml/2006/main">
+              <a:graphicData uri="http://schemas.openxmlformats.org/drawingml/2006/picture">
+                <pic:pic xmlns:pic="http://schemas.openxmlformats.org/drawingml/2006/picture">
+                  <pic:nvPicPr>
+                    <pic:cNvPr id="4" name="Picture 4" descr="IMG_256"/>
+                    <pic:cNvPicPr>
+                      <a:picLocks noChangeAspect="1"/>
+                    </pic:cNvPicPr>
+                  </pic:nvPicPr>
+                  <pic:blipFill>
+                    <a:blip r:embed="rId6"/>
+                    <a:stretch>
+                      <a:fillRect/>
+                    </a:stretch>
+                  </pic:blipFill>
+                  <pic:spPr>
+                    <a:xfrm>
+                      <a:off x="0" y="0"/>
+                      <a:ext cx="6035675" cy="2727960"/>
+                    </a:xfrm>
+                    <a:prstGeom prst="rect">
+                      <a:avLst/>
+                    </a:prstGeom>
+                    <a:noFill/>
+                    <a:ln w="9525">
+                      <a:noFill/>
+                    </a:ln>
+                  </pic:spPr>
+                </pic:pic>
+              </a:graphicData>
+            </a:graphic>
+          </wp:anchor>
+        </w:drawing>
+      </w:r>
+    </w:p>
+    <w:p>
+      <w:pPr>
+        <w:pStyle w:val="16"/>
+        <w:numPr>
+          <w:numId w:val="0"/>
+        </w:numPr>
+        <w:spacing w:before="40" w:after="40"/>
+        <w:ind w:leftChars="0"/>
+        <w:rPr>
+          <w:rFonts w:hint="default" w:ascii="Times New Roman" w:hAnsi="Times New Roman" w:cs="Times New Roman"/>
+        </w:rPr>
+      </w:pPr>
+    </w:p>
+    <w:p>
+      <w:pPr>
+        <w:keepNext w:val="0"/>
+        <w:keepLines w:val="0"/>
+        <w:widowControl/>
+        <w:suppressLineNumbers w:val="0"/>
+        <w:jc w:val="left"/>
+      </w:pPr>
+      <w:r>
+        <w:rPr>
+          <w:rFonts w:ascii="SimSun" w:hAnsi="SimSun" w:eastAsia="SimSun" w:cs="SimSun"/>
+          <w:kern w:val="0"/>
+          <w:sz w:val="24"/>
+          <w:szCs w:val="24"/>
+          <w:lang w:val="en-US" w:eastAsia="zh-CN" w:bidi="ar"/>
+        </w:rPr>
+        <w:drawing>
+          <wp:inline distT="0" distB="0" distL="114300" distR="114300">
+            <wp:extent cx="6271895" cy="3604895"/>
+            <wp:effectExtent l="0" t="0" r="6985" b="6985"/>
+            <wp:docPr id="3" name="Picture 3" descr="IMG_256"/>
+            <wp:cNvGraphicFramePr>
+              <a:graphicFrameLocks xmlns:a="http://schemas.openxmlformats.org/drawingml/2006/main" noChangeAspect="1"/>
+            </wp:cNvGraphicFramePr>
+            <a:graphic xmlns:a="http://schemas.openxmlformats.org/drawingml/2006/main">
+              <a:graphicData uri="http://schemas.openxmlformats.org/drawingml/2006/picture">
+                <pic:pic xmlns:pic="http://schemas.openxmlformats.org/drawingml/2006/picture">
+                  <pic:nvPicPr>
+                    <pic:cNvPr id="3" name="Picture 3" descr="IMG_256"/>
+                    <pic:cNvPicPr>
+                      <a:picLocks noChangeAspect="1"/>
+                    </pic:cNvPicPr>
+                  </pic:nvPicPr>
+                  <pic:blipFill>
+                    <a:blip r:embed="rId7"/>
+                    <a:stretch>
+                      <a:fillRect/>
+                    </a:stretch>
+                  </pic:blipFill>
+                  <pic:spPr>
+                    <a:xfrm>
+                      <a:off x="0" y="0"/>
+                      <a:ext cx="6271895" cy="3604895"/>
+                    </a:xfrm>
+                    <a:prstGeom prst="rect">
+                      <a:avLst/>
+                    </a:prstGeom>
+                    <a:noFill/>
+                    <a:ln w="9525">
+                      <a:noFill/>
+                    </a:ln>
+                  </pic:spPr>
+                </pic:pic>
+              </a:graphicData>
+            </a:graphic>
+          </wp:inline>
+        </w:drawing>
+      </w:r>
+    </w:p>
+    <w:p>
+      <w:pPr>
         <w:spacing w:before="80" w:after="80"/>
         <w:rPr>
           <w:rFonts w:hint="default" w:ascii="Times New Roman" w:hAnsi="Times New Roman" w:cs="Times New Roman"/>
@@ -988,6 +1125,8 @@
           <w:rFonts w:hint="default" w:ascii="Times New Roman" w:hAnsi="Times New Roman" w:cs="Times New Roman"/>
         </w:rPr>
       </w:pPr>
+      <w:bookmarkStart w:id="0" w:name="_GoBack"/>
+      <w:bookmarkEnd w:id="0"/>
     </w:p>
     <w:p>
       <w:pPr>
@@ -2250,12 +2389,6 @@
             <w:insideH w:val="single" w:color="auto" w:sz="4" w:space="0"/>
             <w:insideV w:val="single" w:color="auto" w:sz="4" w:space="0"/>
           </w:tblBorders>
-          <w:tblCellMar>
-            <w:top w:w="0" w:type="dxa"/>
-            <w:left w:w="10" w:type="dxa"/>
-            <w:bottom w:w="0" w:type="dxa"/>
-            <w:right w:w="10" w:type="dxa"/>
-          </w:tblCellMar>
         </w:tblPrEx>
         <w:trPr>
           <w:tblHeader/>
@@ -15231,7 +15364,7 @@
   <w:docDefaults>
     <w:rPrDefault>
       <w:rPr>
-        <w:rFonts w:ascii="Arial" w:hAnsi="Arial" w:eastAsia="Arial" w:cs="Arial"/>
+        <w:rFonts w:ascii="Times New Roman" w:hAnsi="Times New Roman" w:eastAsia="SimSun" w:cs="Times New Roman"/>
       </w:rPr>
     </w:rPrDefault>
     <w:pPrDefault/>

</xml_diff>